<commit_message>
Ajustes 15/07 parte 02
</commit_message>
<xml_diff>
--- a/docs/Relatorio_Portais_Bloqueados_15-07-2026.docx
+++ b/docs/Relatorio_Portais_Bloqueados_15-07-2026.docx
@@ -37,7 +37,7 @@
         <w:rPr>
           <w:color w:val="52604F"/>
         </w:rPr>
-        <w:t>Levantamento dos 27 portais mapeados a partir da planilha do escritório, agrupados pela causa raiz de cada bloqueio — não por portal isolado. Seis já emitem certidão real em produção. Atualização de 15/07/2026: reteste dos 6 bloqueios de borda a partir da rede real do escritório desbloqueou o MPF e o FGTS, que foram construídos e validados de ponta a ponta com dado real no mesmo dia.</w:t>
+        <w:t>Levantamento dos 27 portais mapeados a partir da planilha do escritório, agrupados pela causa raiz de cada bloqueio — não por portal isolado. 8 já emitem certidão real em produção — dobrou desde a última atualização. Os 3 bloqueios de borda (WAF) que pareciam estruturais foram resolvidos: eram todos o mesmo problema de User-Agent já visto no FGTS/MPF, não bloqueio pesado de verdade.</w:t>
       </w:r>
     </w:p>
     <w:p>
@@ -132,7 +132,7 @@
                 <w:color w:val="2F6F5E"/>
                 <w:sz w:val="44"/>
               </w:rPr>
-              <w:t>6</w:t>
+              <w:t>8</w:t>
             </w:r>
           </w:p>
         </w:tc>
@@ -151,7 +151,7 @@
                 <w:color w:val="9C7327"/>
                 <w:sz w:val="44"/>
               </w:rPr>
-              <w:t>5</w:t>
+              <w:t>7</w:t>
             </w:r>
           </w:p>
         </w:tc>
@@ -167,10 +167,10 @@
             <w:r>
               <w:rPr>
                 <w:b/>
-                <w:color w:val="953B31"/>
+                <w:color w:val="756F5C"/>
                 <w:sz w:val="44"/>
               </w:rPr>
-              <w:t>4</w:t>
+              <w:t>1</w:t>
             </w:r>
           </w:p>
         </w:tc>
@@ -245,7 +245,7 @@
                 <w:color w:val="52604F"/>
                 <w:sz w:val="17"/>
               </w:rPr>
-              <w:t>Bloqueio de borda (WAF), confirmado de novo</w:t>
+              <w:t>Instabilidade, não confirmado</w:t>
             </w:r>
           </w:p>
         </w:tc>
@@ -273,6 +273,100 @@
       <w:pPr>
         <w:spacing w:after="80"/>
       </w:pPr>
+    </w:p>
+    <w:p>
+      <w:pPr>
+        <w:pBdr>
+          <w:left w:val="single" w:sz="18" w:space="8" w:color="2F6F5E"/>
+        </w:pBdr>
+        <w:spacing w:before="360" w:after="40"/>
+      </w:pPr>
+      <w:r>
+        <w:rPr>
+          <w:b/>
+          <w:color w:val="1E2A22"/>
+          <w:sz w:val="28"/>
+        </w:rPr>
+        <w:t>Funcionando hoje, em produção</w:t>
+      </w:r>
+    </w:p>
+    <w:p>
+      <w:pPr>
+        <w:pBdr>
+          <w:left w:val="single" w:sz="18" w:space="8" w:color="2F6F5E"/>
+        </w:pBdr>
+        <w:spacing w:after="200"/>
+      </w:pPr>
+      <w:r>
+        <w:rPr>
+          <w:i/>
+          <w:color w:val="2F6F5E"/>
+          <w:sz w:val="18"/>
+        </w:rPr>
+        <w:t>8 portais — nenhuma ação pendente</w:t>
+      </w:r>
+    </w:p>
+    <w:p>
+      <w:pPr>
+        <w:pBdr>
+          <w:left w:val="single" w:sz="18" w:space="8" w:color="2F6F5E"/>
+        </w:pBdr>
+        <w:spacing w:after="20"/>
+      </w:pPr>
+      <w:r>
+        <w:rPr>
+          <w:b/>
+          <w:color w:val="1E2A22"/>
+          <w:sz w:val="23"/>
+        </w:rPr>
+        <w:t>Os 4 originais</w:t>
+      </w:r>
+    </w:p>
+    <w:p>
+      <w:pPr>
+        <w:pBdr>
+          <w:left w:val="single" w:sz="18" w:space="8" w:color="2F6F5E"/>
+        </w:pBdr>
+        <w:spacing w:after="200"/>
+      </w:pPr>
+      <w:r>
+        <w:rPr>
+          <w:color w:val="52604F"/>
+          <w:sz w:val="20"/>
+        </w:rPr>
+        <w:t>CPF — Situação Cadastral (Receita Federal); Débitos Trabalhistas — CNDT (TST); Certidão de Cadastro de Imóvel (Curitiba); Consulta de Débitos/Dívida Ativa (Curitiba).</w:t>
+      </w:r>
+    </w:p>
+    <w:p>
+      <w:pPr>
+        <w:pBdr>
+          <w:left w:val="single" w:sz="18" w:space="8" w:color="2F6F5E"/>
+        </w:pBdr>
+        <w:spacing w:after="20"/>
+      </w:pPr>
+      <w:r>
+        <w:rPr>
+          <w:b/>
+          <w:color w:val="1E2A22"/>
+          <w:sz w:val="23"/>
+        </w:rPr>
+        <w:t>+4 construídos e validados nesta rodada</w:t>
+      </w:r>
+    </w:p>
+    <w:p>
+      <w:pPr>
+        <w:pBdr>
+          <w:left w:val="single" w:sz="18" w:space="8" w:color="2F6F5E"/>
+        </w:pBdr>
+        <w:spacing w:after="200"/>
+      </w:pPr>
+      <w:r>
+        <w:rPr>
+          <w:color w:val="52604F"/>
+          <w:sz w:val="20"/>
+        </w:rPr>
+        <w:t>FGTS (Caixa) — sem captcha, CRF real capturado. MPF — Cloudflare Turnstile resolvido, certidão "NADA CONSTA" com selo digital. Curitiba CND (Pessoa Física) — captcha Altcha (prova computacional, sem custo), certidão negativa real gerada várias vezes. TRT9 — captcha de imagem via 2captcha, certidão "NÃO CONSTAM" validada 4 vezes seguidas.</w:t>
+      </w:r>
     </w:p>
     <w:p>
       <w:pPr>
@@ -465,6 +559,37 @@
     <w:p>
       <w:pPr>
         <w:pBdr>
+          <w:left w:val="single" w:sz="18" w:space="8" w:color="3E5A78"/>
+        </w:pBdr>
+        <w:spacing w:after="20"/>
+      </w:pPr>
+      <w:r>
+        <w:rPr>
+          <w:b/>
+          <w:color w:val="1E2A22"/>
+          <w:sz w:val="23"/>
+        </w:rPr>
+        <w:t>Ministério Público do Trabalho (MPT)</w:t>
+      </w:r>
+    </w:p>
+    <w:p>
+      <w:pPr>
+        <w:pBdr>
+          <w:left w:val="single" w:sz="18" w:space="8" w:color="3E5A78"/>
+        </w:pBdr>
+        <w:spacing w:after="200"/>
+      </w:pPr>
+      <w:r>
+        <w:rPr>
+          <w:color w:val="52604F"/>
+          <w:sz w:val="20"/>
+        </w:rPr>
+        <w:t>Formulário e navegação já corrigidos (dois bugs reais de código resolvidos), mas o captcha é reCAPTCHA Enterprise e o 2captcha falha a maioria das vezes em resolvê-lo (confirmado 3x seguidas). Já funcionou pelo menos uma vez — não é mais bug nosso, é taxa de acerto baixa do provedor de captcha pra esse tipo específico.</w:t>
+      </w:r>
+    </w:p>
+    <w:p>
+      <w:pPr>
+        <w:pBdr>
           <w:left w:val="single" w:sz="18" w:space="8" w:color="3F8A5B"/>
         </w:pBdr>
         <w:spacing w:before="360" w:after="40"/>
@@ -475,7 +600,7 @@
           <w:color w:val="1E2A22"/>
           <w:sz w:val="28"/>
         </w:rPr>
-        <w:t>Novidade: MPF e FGTS desbloquearam e já estão em produção</w:t>
+        <w:t>Quase pronto — falta só um dado real pra validar</w:t>
       </w:r>
     </w:p>
     <w:p>
@@ -491,7 +616,7 @@
           <w:color w:val="3F8A5B"/>
           <w:sz w:val="18"/>
         </w:rPr>
-        <w:t>construídos e validados de ponta a ponta com dado real em 15/07/2026</w:t>
+        <w:t>depende de: uma Indicação Fiscal + CPF/CNPJ real de um imóvel de Curitiba</w:t>
       </w:r>
     </w:p>
     <w:p>
@@ -507,7 +632,7 @@
           <w:color w:val="1E2A22"/>
           <w:sz w:val="23"/>
         </w:rPr>
-        <w:t>Ministério Público Federal — Certidão Negativa</w:t>
+        <w:t>Certidão de Tributos Municipais — Imóvel (Curitiba)</w:t>
       </w:r>
     </w:p>
     <w:p>
@@ -522,195 +647,7 @@
           <w:color w:val="52604F"/>
           <w:sz w:val="20"/>
         </w:rPr>
-        <w:t>Antes bloqueado por WAF genérico ("Web Page Blocked") testando do ambiente de desenvolvimento (datacenter/cloud) — abriu limpo saindo da rede real do escritório. Worker construído com captcha Cloudflare Turnstile resolvido de verdade (2captcha); validado com CPF real — certidão "NADA CONSTA" com selo digital conferido.</w:t>
-      </w:r>
-    </w:p>
-    <w:p>
-      <w:pPr>
-        <w:pBdr>
-          <w:left w:val="single" w:sz="18" w:space="8" w:color="3F8A5B"/>
-        </w:pBdr>
-        <w:spacing w:after="20"/>
-      </w:pPr>
-      <w:r>
-        <w:rPr>
-          <w:b/>
-          <w:color w:val="1E2A22"/>
-          <w:sz w:val="23"/>
-        </w:rPr>
-        <w:t>FGTS — Situação de Regularidade do Empregador (Caixa)</w:t>
-      </w:r>
-    </w:p>
-    <w:p>
-      <w:pPr>
-        <w:pBdr>
-          <w:left w:val="single" w:sz="18" w:space="8" w:color="3F8A5B"/>
-        </w:pBdr>
-        <w:spacing w:after="200"/>
-      </w:pPr>
-      <w:r>
-        <w:rPr>
-          <w:color w:val="52604F"/>
-          <w:sz w:val="20"/>
-        </w:rPr>
-        <w:t>Antes bloqueado pelo ShieldSquare/Radware Bot Manager testando do ambiente de desenvolvimento — abriu limpo saindo da rede real do escritório. Sem captcha em nenhuma etapa; validado com CNPJ real do escritório — resultado "REGULAR" com o Certificado de Regularidade (CRF) capturado.</w:t>
-      </w:r>
-    </w:p>
-    <w:p>
-      <w:pPr>
-        <w:pBdr>
-          <w:left w:val="single" w:sz="18" w:space="8" w:color="3F8A5B"/>
-        </w:pBdr>
-        <w:spacing w:after="200"/>
-      </w:pPr>
-      <w:r>
-        <w:rPr>
-          <w:i/>
-          <w:color w:val="7C8878"/>
-          <w:sz w:val="19"/>
-        </w:rPr>
-        <w:t>Confirma a hipótese: o bloqueio original era por reputação de IP do ambiente de teste, não detecção de automação. Na construção apareceram 3 bugs reais só visíveis rodando de verdade com captcha pago: bloqueio por User-Agent do Chromium headless (corrigido sobrescrevendo o UA), o hook do Turnstile enganando a checagem de "já carregado" do próprio Cloudflare (corrigido com polling em vez de interceptar a atribuição), e o link de download do MPF não gerando arquivo nem evento de rede no Chromium headless (corrigido com fetch() direto de dentro da página). Detalhes completos no topo de cada worker.py.</w:t>
-      </w:r>
-    </w:p>
-    <w:p>
-      <w:pPr>
-        <w:pBdr>
-          <w:left w:val="single" w:sz="18" w:space="8" w:color="953B31"/>
-        </w:pBdr>
-        <w:spacing w:before="360" w:after="40"/>
-      </w:pPr>
-      <w:r>
-        <w:rPr>
-          <w:b/>
-          <w:color w:val="1E2A22"/>
-          <w:sz w:val="28"/>
-        </w:rPr>
-        <w:t>Bloqueio de firewall / anti-bot na borda</w:t>
-      </w:r>
-    </w:p>
-    <w:p>
-      <w:pPr>
-        <w:pBdr>
-          <w:left w:val="single" w:sz="18" w:space="8" w:color="953B31"/>
-        </w:pBdr>
-        <w:spacing w:after="200"/>
-      </w:pPr>
-      <w:r>
-        <w:rPr>
-          <w:i/>
-          <w:color w:val="953B31"/>
-          <w:sz w:val="18"/>
-        </w:rPr>
-        <w:t>confirmado de novo em 15/07/2026, a partir da rede real do escritório</w:t>
-      </w:r>
-    </w:p>
-    <w:p>
-      <w:pPr>
-        <w:pBdr>
-          <w:left w:val="single" w:sz="18" w:space="8" w:color="953B31"/>
-        </w:pBdr>
-        <w:spacing w:after="20"/>
-      </w:pPr>
-      <w:r>
-        <w:rPr>
-          <w:b/>
-          <w:color w:val="1E2A22"/>
-          <w:sz w:val="23"/>
-        </w:rPr>
-        <w:t>Prefeitura de Curitiba — CND e Débitos do Imóvel/IPTU</w:t>
-      </w:r>
-    </w:p>
-    <w:p>
-      <w:pPr>
-        <w:pBdr>
-          <w:left w:val="single" w:sz="18" w:space="8" w:color="953B31"/>
-        </w:pBdr>
-        <w:spacing w:after="200"/>
-      </w:pPr>
-      <w:r>
-        <w:rPr>
-          <w:color w:val="52604F"/>
-          <w:sz w:val="20"/>
-        </w:rPr>
-        <w:t>Domínio inteiro bloqueado pelo Akamai Bot Manager ("Access Denied") já na página inicial, antes de qualquer formulário — mesmo bloqueio nas duas certidões, por serem o mesmo domínio. Retestado da rede real: continua idêntico.</w:t>
-      </w:r>
-    </w:p>
-    <w:p>
-      <w:pPr>
-        <w:pBdr>
-          <w:left w:val="single" w:sz="18" w:space="8" w:color="953B31"/>
-        </w:pBdr>
-        <w:spacing w:after="20"/>
-      </w:pPr>
-      <w:r>
-        <w:rPr>
-          <w:b/>
-          <w:color w:val="1E2A22"/>
-          <w:sz w:val="23"/>
-        </w:rPr>
-        <w:t>PJe — Ações Trabalhistas (TRT9)</w:t>
-      </w:r>
-    </w:p>
-    <w:p>
-      <w:pPr>
-        <w:pBdr>
-          <w:left w:val="single" w:sz="18" w:space="8" w:color="953B31"/>
-        </w:pBdr>
-        <w:spacing w:after="200"/>
-      </w:pPr>
-      <w:r>
-        <w:rPr>
-          <w:color w:val="52604F"/>
-          <w:sz w:val="20"/>
-        </w:rPr>
-        <w:t>CloudFront devolve "403 Request blocked" logo na entrada do site. Retestado da rede real: continua idêntico.</w:t>
-      </w:r>
-    </w:p>
-    <w:p>
-      <w:pPr>
-        <w:pBdr>
-          <w:left w:val="single" w:sz="18" w:space="8" w:color="953B31"/>
-        </w:pBdr>
-        <w:spacing w:after="20"/>
-      </w:pPr>
-      <w:r>
-        <w:rPr>
-          <w:b/>
-          <w:color w:val="1E2A22"/>
-          <w:sz w:val="23"/>
-        </w:rPr>
-        <w:t>Ministério Público do Trabalho</w:t>
-      </w:r>
-    </w:p>
-    <w:p>
-      <w:pPr>
-        <w:pBdr>
-          <w:left w:val="single" w:sz="18" w:space="8" w:color="953B31"/>
-        </w:pBdr>
-        <w:spacing w:after="200"/>
-      </w:pPr>
-      <w:r>
-        <w:rPr>
-          <w:color w:val="52604F"/>
-          <w:sz w:val="20"/>
-        </w:rPr>
-        <w:t>Bloqueio genérico, mesmo identificador de ataque visto no MPF originalmente. Retestado da rede real: continua bloqueado (403 Forbidden), embora a assinatura da página de erro tenha mudado — pode ser reconfiguração do WAF deles.</w:t>
-      </w:r>
-    </w:p>
-    <w:p>
-      <w:pPr>
-        <w:pBdr>
-          <w:left w:val="single" w:sz="18" w:space="8" w:color="953B31"/>
-        </w:pBdr>
-        <w:spacing w:after="200"/>
-      </w:pPr>
-      <w:r>
-        <w:rPr>
-          <w:i/>
-          <w:color w:val="7C8878"/>
-          <w:sz w:val="19"/>
-        </w:rPr>
-        <w:t>Diferente do MPF e do FGTS, esses três não desbloquearam saindo da rede real — sinal de que o bloqueio é mais estrutural (regra do WAF pro domínio inteiro, ou geolocalização/ASN específicos), não simples reputação de IP de datacenter. Resolver exigiria proxy residencial dedicado ou serviço especializado de bypass — investimento adicional, mesma categoria do que já foi descartado por orçamento.</w:t>
+        <w:t>Mesma plataforma/captcha (Altcha) do CND, que já funciona. Mecânica toda testada e corrigida — inclusive um campo novo adicionado no painel pra digitar o CPF/CNPJ do proprietário. Só falta um imóvel de verdade (com Indicação Fiscal e dono reais) pra confirmar o resultado final do portal.</w:t>
       </w:r>
     </w:p>
     <w:p>

</xml_diff>

<commit_message>
Workers nativos Receita Federal/Pinhais, fix MPF, painel
- Sobe Pinhais como worker nativo no Windows (bind-mount C:/data no
  gateway para servir os downloads, mesmo esquema do receita_federal
  e sefaz_pr_certidao_debitos)
- SEFAZ PR: remove 2captcha, adota clique real (user_gesture) e
  digitação humanizada — bloqueio de automação segue sem solução
  confirmada
- Corrige captura de certidão do MPF para CNPJ (retry + diagnóstico
  no fetch)
- Front: atualiza painel em background tab (visibilitychange) e
  valida tipo de documento por portal antes de submeter pedido
- Ignora *.log no git (logs de worker são runtime, não deveriam ser
  versionados)
- Atualiza relatório de portais bloqueados

Co-Authored-By: Claude Sonnet 5 <noreply@anthropic.com>
</commit_message>
<xml_diff>
--- a/docs/Relatorio_Portais_Bloqueados_15-07-2026.docx
+++ b/docs/Relatorio_Portais_Bloqueados_15-07-2026.docx
@@ -37,7 +37,7 @@
         <w:rPr>
           <w:color w:val="52604F"/>
         </w:rPr>
-        <w:t>Levantamento dos 27 portais mapeados a partir da planilha do escritório, agrupados pela causa raiz de cada bloqueio — não por portal isolado. 8 já emitem certidão real em produção — dobrou desde a última atualização. Os 3 bloqueios de borda (WAF) que pareciam estruturais foram resolvidos: eram todos o mesmo problema de User-Agent já visto no FGTS/MPF, não bloqueio pesado de verdade.</w:t>
+        <w:t>Levantamento dos 27 portais mapeados a partir da planilha do escritório, agrupados pela causa raiz de cada bloqueio — não por portal isolado. 10 já emitem certidão real em produção. Os últimos dois a caírem foram a Certidão Conjunta (Receita Federal) e a Certidão Negativa de Débitos de Pinhais: o bloqueio dos dois nunca foi o código, era o ambiente Linux do servidor — rodando o mesmo worker nativo no Windows, sem mudar a automação, os dois passaram de primeira. O SEFAZ PR, por outro lado, teve o diagnóstico revisado pra pior: não é mais considerado "quase resolvido" — testamos rede diferente, documento diferente e até o Chrome de verdade da máquina, e nada mudou o bloqueio. Só o acesso manual (sem automação) passa. Fica na mesma categoria de "sem solução clara" do CNPJ+QSA e do MPT.</w:t>
       </w:r>
     </w:p>
     <w:p>
@@ -57,7 +57,7 @@
           <w:color w:val="7C8878"/>
           <w:sz w:val="18"/>
         </w:rPr>
-        <w:t>15/07/2026</w:t>
+        <w:t>20/07/2026</w:t>
       </w:r>
       <w:r>
         <w:rPr>
@@ -132,7 +132,7 @@
                 <w:color w:val="2F6F5E"/>
                 <w:sz w:val="44"/>
               </w:rPr>
-              <w:t>8</w:t>
+              <w:t>10</w:t>
             </w:r>
           </w:p>
         </w:tc>
@@ -151,7 +151,7 @@
                 <w:color w:val="9C7327"/>
                 <w:sz w:val="44"/>
               </w:rPr>
-              <w:t>7</w:t>
+              <w:t>5</w:t>
             </w:r>
           </w:p>
         </w:tc>
@@ -303,7 +303,7 @@
           <w:color w:val="2F6F5E"/>
           <w:sz w:val="18"/>
         </w:rPr>
-        <w:t>8 portais — nenhuma ação pendente</w:t>
+        <w:t>10 portais — testado e comprovado com dado real</w:t>
       </w:r>
     </w:p>
     <w:p>
@@ -350,7 +350,7 @@
           <w:color w:val="1E2A22"/>
           <w:sz w:val="23"/>
         </w:rPr>
-        <w:t>+4 construídos e validados nesta rodada</w:t>
+        <w:t>+4 construídos e validados numa rodada anterior</w:t>
       </w:r>
     </w:p>
     <w:p>
@@ -371,39 +371,7 @@
     <w:p>
       <w:pPr>
         <w:pBdr>
-          <w:left w:val="single" w:sz="18" w:space="8" w:color="9C7327"/>
-        </w:pBdr>
-        <w:spacing w:before="360" w:after="40"/>
-      </w:pPr>
-      <w:r>
-        <w:rPr>
-          <w:b/>
-          <w:color w:val="1E2A22"/>
-          <w:sz w:val="28"/>
-        </w:rPr>
-        <w:t>Bloqueio por ambiente Linux do servidor</w:t>
-      </w:r>
-    </w:p>
-    <w:p>
-      <w:pPr>
-        <w:pBdr>
-          <w:left w:val="single" w:sz="18" w:space="8" w:color="9C7327"/>
-        </w:pBdr>
-        <w:spacing w:after="200"/>
-      </w:pPr>
-      <w:r>
-        <w:rPr>
-          <w:i/>
-          <w:color w:val="9C7327"/>
-          <w:sz w:val="18"/>
-        </w:rPr>
-        <w:t>depende de: uma máquina Windows dedicada, sempre ligada</w:t>
-      </w:r>
-    </w:p>
-    <w:p>
-      <w:pPr>
-        <w:pBdr>
-          <w:left w:val="single" w:sz="18" w:space="8" w:color="9C7327"/>
+          <w:left w:val="single" w:sz="18" w:space="8" w:color="2F6F5E"/>
         </w:pBdr>
         <w:spacing w:after="20"/>
       </w:pPr>
@@ -413,13 +381,13 @@
           <w:color w:val="1E2A22"/>
           <w:sz w:val="23"/>
         </w:rPr>
-        <w:t>Certidão Conjunta — Receita Federal</w:t>
+        <w:t>+2 destravados rodando nativo no Windows: Receita Federal e Pinhais</w:t>
       </w:r>
     </w:p>
     <w:p>
       <w:pPr>
         <w:pBdr>
-          <w:left w:val="single" w:sz="18" w:space="8" w:color="9C7327"/>
+          <w:left w:val="single" w:sz="18" w:space="8" w:color="2F6F5E"/>
         </w:pBdr>
         <w:spacing w:after="200"/>
       </w:pPr>
@@ -428,38 +396,7 @@
           <w:color w:val="52604F"/>
           <w:sz w:val="20"/>
         </w:rPr>
-        <w:t>A submissão funciona perfeitamente — preenche e envia certinho — mas o serviço responde com um erro genérico ("023 — tente novamente") sempre que roda em Linux, com ou sem Docker. Confirmado até rodando Linux puro, sem container nenhum. O mesmo fluxo, nativo no Windows, funciona toda vez. Não é um problema de código nosso, é o sistema operacional que a Receita detecta.</w:t>
-      </w:r>
-    </w:p>
-    <w:p>
-      <w:pPr>
-        <w:pBdr>
-          <w:left w:val="single" w:sz="18" w:space="8" w:color="9C7327"/>
-        </w:pBdr>
-        <w:spacing w:after="20"/>
-      </w:pPr>
-      <w:r>
-        <w:rPr>
-          <w:b/>
-          <w:color w:val="1E2A22"/>
-          <w:sz w:val="23"/>
-        </w:rPr>
-        <w:t>Certidão Negativa de Débitos — Prefeitura de Pinhais</w:t>
-      </w:r>
-    </w:p>
-    <w:p>
-      <w:pPr>
-        <w:pBdr>
-          <w:left w:val="single" w:sz="18" w:space="8" w:color="9C7327"/>
-        </w:pBdr>
-        <w:spacing w:after="200"/>
-      </w:pPr>
-      <w:r>
-        <w:rPr>
-          <w:color w:val="52604F"/>
-          <w:sz w:val="20"/>
-        </w:rPr>
-        <w:t>O portal mais simples construído até agora — não tem captcha em nenhuma etapa. O caminho de "CPF/CNPJ não é contribuinte" já roda em produção, inclusive em Docker. O caminho de sucesso esbarra no mesmo alerta antifraude de ambiente Linux visto acima.</w:t>
+        <w:t>Certidão Conjunta (Receita Federal): 100% comprovado, pedido real feito pelo próprio painel, voltou "Certidão Válida Encontrada" e o PDF baixou certinho. Certidão Negativa de Débitos (Pinhais): mesmo diagnóstico, mesma solução — testado com o CNPJ do próprio escritório, certidão real emitida (nº 45963/2026, "INEXISTEM DÉBITOS", QR code de autenticidade). Em ambos, o bloqueio nunca foi o código — era o sistema operacional do servidor (Linux/Docker); os dois portais detectam esse ambiente e recusam com um alerta antifraude genérico, mesmo com Chromium real ou headless via Xvfb. A solução foi rodar o mesmo worker, sem mudar uma linha de automação, como processo nativo direto no Windows (fora do Docker), conectado nas mesmas filas. Ressalva sobre a Receita Federal: depois de várias tentativas seguidas no mesmo dia (nossos próprios testes), ela passou a devolver um erro de "tente novamente dentro de alguns minutos" — é limite de repetição da própria Receita por volume de tentativas em pouco tempo, não é o bloqueio antigo voltando. Recomendado espaçar os testes desse portal específico.</w:t>
       </w:r>
     </w:p>
     <w:p>
@@ -475,7 +412,7 @@
           <w:color w:val="1E2A22"/>
           <w:sz w:val="28"/>
         </w:rPr>
-        <w:t>Bloqueio de captcha ou validação de IP</w:t>
+        <w:t>Bloqueado, sem solução clara com as ferramentas atuais</w:t>
       </w:r>
     </w:p>
     <w:p>
@@ -491,7 +428,38 @@
           <w:color w:val="3E5A78"/>
           <w:sz w:val="18"/>
         </w:rPr>
-        <w:t>depende de: proxy dedicado ou outro provedor de captcha</w:t>
+        <w:t>depende de: proxy dedicado, outro provedor de captcha, ou nova abordagem de automação</w:t>
+      </w:r>
+    </w:p>
+    <w:p>
+      <w:pPr>
+        <w:pBdr>
+          <w:left w:val="single" w:sz="18" w:space="8" w:color="3E5A78"/>
+        </w:pBdr>
+        <w:spacing w:after="20"/>
+      </w:pPr>
+      <w:r>
+        <w:rPr>
+          <w:b/>
+          <w:color w:val="1E2A22"/>
+          <w:sz w:val="23"/>
+        </w:rPr>
+        <w:t>SEFAZ PR — Débitos Tributários e Dívida Ativa</w:t>
+      </w:r>
+    </w:p>
+    <w:p>
+      <w:pPr>
+        <w:pBdr>
+          <w:left w:val="single" w:sz="18" w:space="8" w:color="3E5A78"/>
+        </w:pBdr>
+        <w:spacing w:after="200"/>
+      </w:pPr>
+      <w:r>
+        <w:rPr>
+          <w:color w:val="52604F"/>
+          <w:sz w:val="20"/>
+        </w:rPr>
+        <w:t>Resumo: bloqueia a automação mesmo rodando nativo no Windows, com tela — e nada que testamos mudou isso (rede diferente, CNPJ diferente, até o Chrome de verdade instalado na máquina em vez do Chromium do nodriver). Um acesso 100% manual, sem automação nenhuma, funciona de primeira com o mesmo CNPJ, na mesma máquina. Ou seja: o site parece detectar a própria automação (via protocolo CDP), não a rede, o documento ou o navegador — um tipo de bloqueio bem mais difícil de contornar do que os outros já resolvidos.</w:t>
       </w:r>
     </w:p>
     <w:p>
@@ -522,38 +490,7 @@
           <w:color w:val="52604F"/>
           <w:sz w:val="20"/>
         </w:rPr>
-        <w:t>O captcha é resolvido de verdade e a página reconhece o token como válido — mas o backend rejeita na validação final ("erro ao validar captcha"). Hipótese mais provável: o site confere se o IP de quem resolveu o captcha bate com o IP de quem envia o formulário, e eles são diferentes.</w:t>
-      </w:r>
-    </w:p>
-    <w:p>
-      <w:pPr>
-        <w:pBdr>
-          <w:left w:val="single" w:sz="18" w:space="8" w:color="3E5A78"/>
-        </w:pBdr>
-        <w:spacing w:after="20"/>
-      </w:pPr>
-      <w:r>
-        <w:rPr>
-          <w:b/>
-          <w:color w:val="1E2A22"/>
-          <w:sz w:val="23"/>
-        </w:rPr>
-        <w:t>SEFAZ PR — Débitos Tributários e Dívida Ativa</w:t>
-      </w:r>
-    </w:p>
-    <w:p>
-      <w:pPr>
-        <w:pBdr>
-          <w:left w:val="single" w:sz="18" w:space="8" w:color="3E5A78"/>
-        </w:pBdr>
-        <w:spacing w:after="200"/>
-      </w:pPr>
-      <w:r>
-        <w:rPr>
-          <w:color w:val="52604F"/>
-          <w:sz w:val="20"/>
-        </w:rPr>
-        <w:t>Bloqueia uma etapa antes do CNPJ+QSA: o próprio serviço de resolução de captcha (2captcha) não consegue nem gerar um token para o reCAPTCHA Enterprise invisível do site. Não é limitação do nosso código.</w:t>
+        <w:t>Resumo: o captcha é resolvido de verdade, mas o backend rejeita na validação final. Suspeita: o site confere se o IP de quem resolveu o captcha bate com o IP de quem envia o formulário, e eles são diferentes.</w:t>
       </w:r>
     </w:p>
     <w:p>
@@ -584,7 +521,7 @@
           <w:color w:val="52604F"/>
           <w:sz w:val="20"/>
         </w:rPr>
-        <w:t>Formulário e navegação já corrigidos (dois bugs reais de código resolvidos), mas o captcha é reCAPTCHA Enterprise e o 2captcha falha a maioria das vezes em resolvê-lo (confirmado 3x seguidas). Já funcionou pelo menos uma vez — não é mais bug nosso, é taxa de acerto baixa do provedor de captcha pra esse tipo específico.</w:t>
+        <w:t>Resumo: código correto (testado e validado pelo menos uma vez), mas o captcha é reCAPTCHA Enterprise e o 2captcha erra a maioria das vezes em resolvê-lo — taxa de acerto baixa do provedor, não bug nosso.</w:t>
       </w:r>
     </w:p>
     <w:p>

</xml_diff>

<commit_message>
Guia amarela finalizada e pronta para testes
</commit_message>
<xml_diff>
--- a/docs/Relatorio_Portais_Bloqueados_15-07-2026.docx
+++ b/docs/Relatorio_Portais_Bloqueados_15-07-2026.docx
@@ -37,7 +37,7 @@
         <w:rPr>
           <w:color w:val="52604F"/>
         </w:rPr>
-        <w:t>Levantamento dos 27 portais mapeados a partir da planilha do escritório, agrupados pela causa raiz de cada bloqueio — não por portal isolado. 12 já emitem certidão real em produção. O mais recente a entrar foi a Certidão Judicial Cível/Criminal/Eleitoral (JFPR/TRF4): uma investigação anterior tinha concluído que o botão final de download apontava pra um link quebrado no próprio site do TRF4 — uma colaboradora reproduziu o fluxo manualmente e o botão funcionou perfeitamente. Corrigido trocando a reconstrução manual da URL por um clique nativo de verdade no botão (mesma causa raiz de Receita Federal e SEFAZ PR: clique via JavaScript não é reconhecido como confiável pelo site). Antes dele, a Certidão de Tributos Municipais — Imóvel (Curitiba): testado com um imóvel real do escritório, voltou uma Certidão Positiva de Débitos Tributários (nº 868.875) com todos os dados batendo. Certidão Conjunta (Receita Federal) e Certidão Negativa de Débitos de Pinhais também caíram: o bloqueio dos dois nunca foi o código, era o ambiente Linux do servidor — rodando o mesmo worker nativo no Windows, sem mudar a automação, os dois passaram de primeira. O SEFAZ PR, por outro lado, teve o diagnóstico revisado pra pior: não é mais considerado "quase resolvido" — testamos rede diferente, documento diferente e até o Chrome de verdade da máquina, e nada mudou o bloqueio. Só o acesso manual (sem automação) passa. Fica na mesma categoria de "sem solução clara" do CNPJ+QSA e do MPT.</w:t>
+        <w:t>Levantamento dos 27 portais mapeados a partir da planilha do escritório, agrupados pela causa raiz de cada bloqueio — não por portal isolado. 13 já emitem certidão/consulta real em produção. O mais recente a entrar foi o Guia Amarela / Consulta Informativa de Lote (Curitiba): estava marcado como instável (erro de conexão recusada na última tentativa) — na verdade o site só não respondia em HTTPS (porta 443 trava, nunca visto antes), mas funciona normalmente em HTTP puro. Construído do zero (mesma família de automação dos outros portais de Curitiba), validado de ponta a ponta com captcha real e dado real — achamos e corrigimos dois bugs no caminho: o site tenta abrir o resultado numa pop-up automática que o Chromium bloqueia (contornado clicando no link manual de fallback que o próprio site oferece), e a busca por arquivos baixados era case-sensitive e não achava o PDF porque esse site usa extensão maiúscula (".PDF") — corrigido na camada compartilhada, beneficia qualquer worker futuro. Antes dele, a Certidão Judicial Cível/Criminal/Eleitoral (JFPR/TRF4): uma investigação anterior tinha concluído que o botão final de download apontava pra um link quebrado no próprio site do TRF4 — uma colaboradora reproduziu o fluxo manualmente e o botão funcionou perfeitamente. Corrigido trocando a reconstrução manual da URL por um clique nativo de verdade no botão (mesma causa raiz de Receita Federal e SEFAZ PR: clique via JavaScript não é reconhecido como confiável pelo site). Antes dele, a Certidão de Tributos Municipais — Imóvel (Curitiba): testado com um imóvel real do escritório, voltou uma Certidão Positiva de Débitos Tributários (nº 868.875) com todos os dados batendo. Certidão Conjunta (Receita Federal) e Certidão Negativa de Débitos de Pinhais também caíram: o bloqueio dos dois nunca foi o código, era o ambiente Linux do servidor — rodando o mesmo worker nativo no Windows, sem mudar a automação, os dois passaram de primeira. O SEFAZ PR, por outro lado, teve o diagnóstico revisado pra pior: não é mais considerado "quase resolvido" — testamos rede diferente, documento diferente e até o Chrome de verdade da máquina, e nada mudou o bloqueio. Só o acesso manual (sem automação) passa. Fica na mesma categoria de "sem solução clara" do CNPJ+QSA e do MPT.</w:t>
       </w:r>
     </w:p>
     <w:p>
@@ -57,7 +57,7 @@
           <w:color w:val="7C8878"/>
           <w:sz w:val="18"/>
         </w:rPr>
-        <w:t>22/07/2026</w:t>
+        <w:t>23/07/2026</w:t>
       </w:r>
       <w:r>
         <w:rPr>
@@ -111,15 +111,14 @@
         <w:tblLook w:firstColumn="1" w:firstRow="1" w:lastColumn="0" w:lastRow="0" w:noHBand="0" w:noVBand="1" w:val="04A0"/>
       </w:tblPr>
       <w:tblGrid>
-        <w:gridCol w:w="2436"/>
-        <w:gridCol w:w="2436"/>
-        <w:gridCol w:w="2436"/>
-        <w:gridCol w:w="2436"/>
+        <w:gridCol w:w="3249"/>
+        <w:gridCol w:w="3249"/>
+        <w:gridCol w:w="3249"/>
       </w:tblGrid>
       <w:tr>
         <w:tc>
           <w:tcPr>
-            <w:tcW w:type="dxa" w:w="2436"/>
+            <w:tcW w:type="dxa" w:w="3249"/>
           </w:tcPr>
           <w:p>
             <w:pPr>
@@ -132,13 +131,13 @@
                 <w:color w:val="2F6F5E"/>
                 <w:sz w:val="44"/>
               </w:rPr>
-              <w:t>12</w:t>
+              <w:t>13</w:t>
             </w:r>
           </w:p>
         </w:tc>
         <w:tc>
           <w:tcPr>
-            <w:tcW w:type="dxa" w:w="2436"/>
+            <w:tcW w:type="dxa" w:w="3249"/>
           </w:tcPr>
           <w:p>
             <w:pPr>
@@ -157,26 +156,7 @@
         </w:tc>
         <w:tc>
           <w:tcPr>
-            <w:tcW w:type="dxa" w:w="2436"/>
-          </w:tcPr>
-          <w:p>
-            <w:pPr>
-              <w:jc w:val="center"/>
-            </w:pPr>
-            <w:r/>
-            <w:r>
-              <w:rPr>
-                <w:b/>
-                <w:color w:val="756F5C"/>
-                <w:sz w:val="44"/>
-              </w:rPr>
-              <w:t>1</w:t>
-            </w:r>
-          </w:p>
-        </w:tc>
-        <w:tc>
-          <w:tcPr>
-            <w:tcW w:type="dxa" w:w="2436"/>
+            <w:tcW w:type="dxa" w:w="3249"/>
           </w:tcPr>
           <w:p>
             <w:pPr>
@@ -197,7 +177,7 @@
       <w:tr>
         <w:tc>
           <w:tcPr>
-            <w:tcW w:type="dxa" w:w="2436"/>
+            <w:tcW w:type="dxa" w:w="3249"/>
           </w:tcPr>
           <w:p>
             <w:pPr>
@@ -215,7 +195,7 @@
         </w:tc>
         <w:tc>
           <w:tcPr>
-            <w:tcW w:type="dxa" w:w="2436"/>
+            <w:tcW w:type="dxa" w:w="3249"/>
           </w:tcPr>
           <w:p>
             <w:pPr>
@@ -233,25 +213,7 @@
         </w:tc>
         <w:tc>
           <w:tcPr>
-            <w:tcW w:type="dxa" w:w="2436"/>
-          </w:tcPr>
-          <w:p>
-            <w:pPr>
-              <w:jc w:val="center"/>
-            </w:pPr>
-            <w:r/>
-            <w:r>
-              <w:rPr>
-                <w:color w:val="52604F"/>
-                <w:sz w:val="17"/>
-              </w:rPr>
-              <w:t>Instabilidade, não confirmado</w:t>
-            </w:r>
-          </w:p>
-        </w:tc>
-        <w:tc>
-          <w:tcPr>
-            <w:tcW w:type="dxa" w:w="2436"/>
+            <w:tcW w:type="dxa" w:w="3249"/>
           </w:tcPr>
           <w:p>
             <w:pPr>
@@ -303,7 +265,7 @@
           <w:color w:val="2F6F5E"/>
           <w:sz w:val="18"/>
         </w:rPr>
-        <w:t>12 portais — testado e comprovado com dado real</w:t>
+        <w:t>13 portais — testado e comprovado com dado real</w:t>
       </w:r>
     </w:p>
     <w:p>
@@ -464,6 +426,37 @@
     <w:p>
       <w:pPr>
         <w:pBdr>
+          <w:left w:val="single" w:sz="18" w:space="8" w:color="2F6F5E"/>
+        </w:pBdr>
+        <w:spacing w:after="20"/>
+      </w:pPr>
+      <w:r>
+        <w:rPr>
+          <w:b/>
+          <w:color w:val="1E2A22"/>
+          <w:sz w:val="23"/>
+        </w:rPr>
+        <w:t>+1 novo, construído do zero: Guia Amarela / Consulta Informativa de Lote (Curitiba)</w:t>
+      </w:r>
+    </w:p>
+    <w:p>
+      <w:pPr>
+        <w:pBdr>
+          <w:left w:val="single" w:sz="18" w:space="8" w:color="2F6F5E"/>
+        </w:pBdr>
+        <w:spacing w:after="200"/>
+      </w:pPr>
+      <w:r>
+        <w:rPr>
+          <w:color w:val="52604F"/>
+          <w:sz w:val="20"/>
+        </w:rPr>
+        <w:t>Estava marcado como "instabilidade, ainda não confirmado" (conexão recusada na última tentativa) — na verdade o site só não responde em HTTPS (porta 443 trava sem completar handshake TLS), mas funciona normalmente em HTTP puro. Não é uma certidão formal — é um documento informativo com os parâmetros de zoneamento/uso do solo do imóvel, confirmado testando manualmente. Worker construído do zero (mesma família de automação ASP.NET + captcha de imagem simples dos outros portais de Curitiba já validados), validado de ponta a ponta com captcha real e Indicação Fiscal real — PDF oficial completo (6 páginas) baixado com sucesso. Dois bugs reais encontrados e corrigidos no caminho: (1) o site tenta abrir o resultado numa pop-up automática que o Chromium bloqueia em contexto automatizado — contornado clicando no link manual de fallback ("clique aqui") que o próprio site mostra pra esse caso, igual um humano faria; (2) a busca por arquivos baixados era case-sensitive e nunca achava o PDF real porque esse site serve o arquivo com extensão maiúscula (".PDF") — corrigido na camada compartilhada usada por todos os workers, não só esse.</w:t>
+      </w:r>
+    </w:p>
+    <w:p>
+      <w:pPr>
+        <w:pBdr>
           <w:left w:val="single" w:sz="18" w:space="8" w:color="3E5A78"/>
         </w:pBdr>
         <w:spacing w:before="360" w:after="40"/>
@@ -584,69 +577,6 @@
           <w:sz w:val="20"/>
         </w:rPr>
         <w:t>Resumo: código correto (testado e validado pelo menos uma vez), mas o captcha é reCAPTCHA Enterprise e o 2captcha erra a maioria das vezes em resolvê-lo — taxa de acerto baixa do provedor, não bug nosso.</w:t>
-      </w:r>
-    </w:p>
-    <w:p>
-      <w:pPr>
-        <w:pBdr>
-          <w:left w:val="single" w:sz="18" w:space="8" w:color="756F5C"/>
-        </w:pBdr>
-        <w:spacing w:before="360" w:after="40"/>
-      </w:pPr>
-      <w:r>
-        <w:rPr>
-          <w:b/>
-          <w:color w:val="1E2A22"/>
-          <w:sz w:val="28"/>
-        </w:rPr>
-        <w:t>Instabilidade, ainda não confirmado</w:t>
-      </w:r>
-    </w:p>
-    <w:p>
-      <w:pPr>
-        <w:pBdr>
-          <w:left w:val="single" w:sz="18" w:space="8" w:color="756F5C"/>
-        </w:pBdr>
-        <w:spacing w:after="200"/>
-      </w:pPr>
-      <w:r>
-        <w:rPr>
-          <w:i/>
-          <w:color w:val="756F5C"/>
-          <w:sz w:val="18"/>
-        </w:rPr>
-        <w:t>depende de: uma nova tentativa</w:t>
-      </w:r>
-    </w:p>
-    <w:p>
-      <w:pPr>
-        <w:pBdr>
-          <w:left w:val="single" w:sz="18" w:space="8" w:color="756F5C"/>
-        </w:pBdr>
-        <w:spacing w:after="20"/>
-      </w:pPr>
-      <w:r>
-        <w:rPr>
-          <w:b/>
-          <w:color w:val="1E2A22"/>
-          <w:sz w:val="23"/>
-        </w:rPr>
-        <w:t>Guia Amarela — Curitiba (Imóvel)</w:t>
-      </w:r>
-    </w:p>
-    <w:p>
-      <w:pPr>
-        <w:pBdr>
-          <w:left w:val="single" w:sz="18" w:space="8" w:color="756F5C"/>
-        </w:pBdr>
-        <w:spacing w:after="200"/>
-      </w:pPr>
-      <w:r>
-        <w:rPr>
-          <w:color w:val="52604F"/>
-          <w:sz w:val="20"/>
-        </w:rPr>
-        <w:t>Conexão recusada na última tentativa, tanto pelo navegador quanto por linha de comando direta — pode ser instabilidade temporária do próprio site, ainda não dá para afirmar se é bloqueio.</w:t>
       </w:r>
     </w:p>
     <w:p>

</xml_diff>